<commit_message>
Update manuscript revision documents
</commit_message>
<xml_diff>
--- a/07_Docs/Manuscript/1_Revision/Draft9.docx
+++ b/07_Docs/Manuscript/1_Revision/Draft9.docx
@@ -218,11 +218,7 @@
       </w:r>
       <w:r>
         <w:rPr/>
-        <w:t xml:space="preserve"> </w:t>
-      </w:r>
-      <w:r>
-        <w:rPr/>
-        <w:t>Physiologically based pharmacokinetic (PBPK) models for predicting monoclonal antibody (mAb) pharmacokinetics are well established. This tutorial presents a reproducible PK-Sim/MoBi-R workflow for generating monkey and human mAb PK predictions without calibration with in vivo PK profiles and for using simulations to explore reduced monkey PK study designs within a new approach methodology (NAM) decision framework.</w:t>
+        <w:t xml:space="preserve"> Physiologically based pharmacokinetic (PBPK) models for predicting monoclonal antibody (mAb) pharmacokinetics are well established. This tutorial presents a reproducible PK-Sim/MoBi-R workflow for generating monkey and human mAb PK predictions without calibration with in vivo PK profiles and for using simulations to explore reduced monkey PK study designs within a new approach methodology (NAM) decision framework.</w:t>
       </w:r>
     </w:p>
     <w:p>
@@ -276,11 +272,7 @@
       </w:r>
       <w:r>
         <w:rPr/>
-        <w:t xml:space="preserve"> </w:t>
-      </w:r>
-      <w:r>
-        <w:rPr/>
-        <w:t xml:space="preserve"> For monkey PK, 85.7% (12/14), 92.9% (13/14), and 50.0% (3/6 evaluable) of AUC0-tlast, Cmax, and clearance predictions, respectively, were within two-fold of observed values; the corresponding proportions for human PK were 96.7% (29/30), 96.7% (29/30), and 66.7% (10/15 evaluable). The PBPK framework predicted both AUC</w:t>
+        <w:t xml:space="preserve">  For monkey PK, 85.7% (12/14), 92.9% (13/14), and 50.0% (3/6 evaluable) of AUC0-tlast, Cmax, and clearance predictions, respectively, were within two-fold of observed values; the corresponding proportions for human PK were 96.7% (29/30), 96.7% (29/30), and 66.7% (10/15 evaluable). The PBPK framework predicted both AUC</w:t>
       </w:r>
       <w:r>
         <w:rPr>
@@ -300,15 +292,7 @@
       </w:r>
       <w:r>
         <w:rPr/>
-        <w:t xml:space="preserve"> within two-fold across all evaluated doses for five of the eight molecules. In </w:t>
-      </w:r>
-      <w:r>
-        <w:rPr/>
-        <w:t>a reference,</w:t>
-      </w:r>
-      <w:r>
-        <w:rPr/>
-        <w:t xml:space="preserve"> golimumab, study-design exercise, a two-dose design with three animals per group (total n=6) met the two-fold criterion for all three PK endpoints at both doses in 99.7% and 97.6% of replicate studies under 30% and 50% input variability, respectively.</w:t>
+        <w:t xml:space="preserve"> within two-fold across all evaluated doses for five of the eight molecules. In a reference, golimumab, study-design exercise, a two-dose design with three animals per group (total n=6) met the two-fold criterion for all three PK endpoints at both doses in 99.7% and 97.6% of replicate studies under 30% and 50% input variability, respectively.</w:t>
       </w:r>
     </w:p>
     <w:p>
@@ -325,11 +309,7 @@
       </w:r>
       <w:r>
         <w:rPr/>
-        <w:t xml:space="preserve"> </w:t>
-      </w:r>
-      <w:r>
-        <w:rPr/>
-        <w:t xml:space="preserve">These findings illustrate how PBPK models can connect mechanistic inputs and exposure prediction to design fit-for-purpose preclinical studies.  Further evaluations using larger datasets, incorporating experimentally measured mechanistic inputs, pre-specified decision criteria, and explicit assessment of study objectives, uncertainties, and model and study-design assumptions. This tutorial provides a reproducible framework for conducting such systematic evaluations. </w:t>
+        <w:t xml:space="preserve"> These findings illustrate how PBPK models can connect mechanistic inputs and exposure prediction to design fit-for-purpose preclinical studies.  Further evaluations using larger datasets, incorporating experimentally measured mechanistic inputs, pre-specified decision criteria, and explicit assessment of study objectives, uncertainties, and model and study-design assumptions. This tutorial provides a reproducible framework for conducting such systematic evaluations. </w:t>
       </w:r>
       <w:r>
         <w:br w:type="page"/>
@@ -524,15 +504,7 @@
       </w:pPr>
       <w:r>
         <w:rPr/>
-        <w:t xml:space="preserve">In Vitro Experimental Data: Literature-based target- and molecule-specific data were used to compile drug-FcRn binding, drug-target binding, drug-target complex internalization, target degradation, and target reference concentration inputs. The same target reference and degradation rates were used for each target-specific molecule. Some values came from prior modeling analyses rather than independent in vitro measurements; their </w:t>
-      </w:r>
-      <w:r>
-        <w:rPr/>
-        <w:t>source</w:t>
-      </w:r>
-      <w:r>
-        <w:rPr/>
-        <w:t xml:space="preserve"> is identified in Supplementary Material 2 and considered when interpreting prediction performance.</w:t>
+        <w:t>In Vitro Experimental Data: Literature-based target- and molecule-specific data were used to compile drug-FcRn binding, drug-target binding, drug-target complex internalization, target degradation, and target reference concentration inputs. The same target reference and degradation rates were used for each target-specific molecule. Some values came from prior modeling analyses rather than independent in vitro measurements; their source is identified in Supplementary Material 2 and considered when interpreting prediction performance.</w:t>
       </w:r>
     </w:p>
     <w:p>
@@ -794,15 +766,7 @@
       </w:r>
       <w:r>
         <w:rPr/>
-        <w:t xml:space="preserve"> extrapolated fraction exceeded 20% or could not be estimated </w:t>
-      </w:r>
-      <w:r>
-        <w:rPr/>
-        <w:t>(Supplementary Material 2)</w:t>
-      </w:r>
-      <w:r>
-        <w:rPr/>
-        <w:t>.</w:t>
+        <w:t xml:space="preserve"> extrapolated fraction exceeded 20% or could not be estimated (Supplementary Material 2).</w:t>
       </w:r>
     </w:p>
     <w:p>
@@ -852,7 +816,7 @@
       </w:r>
       <w:r>
         <w:rPr/>
-        <w:t xml:space="preserve"> was within two-fold for every dose except the highest nivolumab dose. Human clearance was evaluable for 15 of 30 scenarios. All four evaluable avelumab clearance predictions were below the two-fold interval, whereas five of six golimumab, three of three adalimumab, and the single bevacizumab and tocilizumab clearance predictions were within two-fold. No human clearance comparison was made for atezolizumab, nivolumab, or pembrolizumab because their observed clearance estimates did not meet the prespecified extrapolation criterion. Within the shared PD-L1 target, all five evaluated atezolizumab doses and three of four avelumab doses met the AUC</w:t>
+        <w:t xml:space="preserve"> was within two-fold for every dose except the highest nivolumab dose. Human clearance was evaluable for 15 of 30 scenarios. Overall, the PBPK approach reasonably predicted observed AUC</w:t>
       </w:r>
       <w:r>
         <w:rPr>
@@ -862,27 +826,57 @@
       </w:r>
       <w:r>
         <w:rPr/>
-        <w:t xml:space="preserve"> criterion; observed clearance was not evaluable for atezolizumab, and none of the four avelumab clearance predictions met the two-fold criterion. This contrast is descriptive and does not isolate its cause. For some molecules, several key target-system parameters, including target reference concentration, internalization rate (k</w:t>
-      </w:r>
-      <w:r>
-        <w:rPr>
-          <w:vertAlign w:val="subscript"/>
-        </w:rPr>
-        <w:t>int</w:t>
-      </w:r>
-      <w:r>
-        <w:rPr/>
-        <w:t>), and target degradation rate (k</w:t>
-      </w:r>
-      <w:r>
-        <w:rPr>
-          <w:vertAlign w:val="subscript"/>
-        </w:rPr>
-        <w:t>deg</w:t>
-      </w:r>
-      <w:r>
-        <w:rPr/>
-        <w:t>), were unavailable from direct in vitro measurements and were obtained from prior modeling studies. These inputs introduce uncertainty because their values may depend on the model structure, assumptions, and estimation approach used in those studies. The observed human PK data for oncology mAbs were also obtained from patients who may exhibit substantial variability in target expression, introducing further uncertainty in the PK predictions. Overall, the PBPK approach reasonably predicted observed AUC</w:t>
+        <w:t xml:space="preserve"> and C</w:t>
+      </w:r>
+      <w:r>
+        <w:rPr>
+          <w:vertAlign w:val="subscript"/>
+        </w:rPr>
+        <w:t>max</w:t>
+      </w:r>
+      <w:r>
+        <w:rPr/>
+        <w:t>, while the clearance analysis was limited by terminal sampling in many observed profiles.</w:t>
+      </w:r>
+    </w:p>
+    <w:p>
+      <w:pPr>
+        <w:pStyle w:val="Heading3"/>
+        <w:rPr/>
+      </w:pPr>
+      <w:r>
+        <w:rPr/>
+        <w:t>Within-Target Comparisons</w:t>
+      </w:r>
+    </w:p>
+    <w:p>
+      <w:pPr>
+        <w:pStyle w:val="BodyText"/>
+        <w:rPr/>
+      </w:pPr>
+      <w:r>
+        <w:rPr/>
+        <w:t>Within-target comparisons included two antibodies each for PD-L1, PD-1, and TNFα. For PD-L1, human Cmax predictions met the two-fold criterion for both atezolizumab and avelumab at all matched doses. AUC0-tlast predictions met the criterion for all atezolizumab doses, whereas the lowest avelumab dose did not. At the shared monkey dose, Cmax met the criterion for both antibodies, whereas avelumab AUC0-tlast did not. For PD-1 in humans, all AUC0-tlast predictions and all but one Cmax prediction for nivolumab and pembrolizumab met the two-fold criterion, including both endpoints at the matched dose. Monkey results were less consistent, with one AUC0-tlast prediction for nivolumab and one Cmax prediction for pembrolizumab outside the criterion. For TNFα, all human AUC0-tlast and Cmax predictions for adalimumab and golimumab met the two-fold criterion, including at matched doses. Clearance predictions also met the criterion at matched doses where this endpoint was evaluable for both antibodies. At the shared monkey dose, AUC0-tlast and Cmax predictions met the criterion for both molecules. These results indicate broadly consistent predictive performance between the two TNFα antibodies. Overall, predictions were consistent within targets, with molecule- and dose-specific deviations for PD-L1 and PD-1, particularly in monkeys.</w:t>
+      </w:r>
+    </w:p>
+    <w:p>
+      <w:pPr>
+        <w:pStyle w:val="Heading1"/>
+        <w:rPr/>
+      </w:pPr>
+      <w:r>
+        <w:rPr/>
+        <w:t>Evaluation of Simulations-based Study Designs</w:t>
+      </w:r>
+    </w:p>
+    <w:p>
+      <w:pPr>
+        <w:pStyle w:val="Normal"/>
+        <w:rPr/>
+      </w:pPr>
+      <w:r>
+        <w:rPr/>
+        <w:t>Golimumab was selected for the study-design exercise because the monkey PBPK model without calibration to the analyzed in vivo data predicted AUC</w:t>
       </w:r>
       <w:r>
         <w:rPr>
@@ -892,7 +886,7 @@
       </w:r>
       <w:r>
         <w:rPr/>
-        <w:t xml:space="preserve"> and C</w:t>
+        <w:t>, C</w:t>
       </w:r>
       <w:r>
         <w:rPr>
@@ -902,17 +896,27 @@
       </w:r>
       <w:r>
         <w:rPr/>
-        <w:t>, while the clearance analysis was limited by terminal sampling in many observed profiles.</w:t>
-      </w:r>
-    </w:p>
-    <w:p>
-      <w:pPr>
-        <w:pStyle w:val="Normal"/>
-        <w:rPr/>
-      </w:pPr>
-      <w:r>
-        <w:rPr/>
-        <w:t>Golimumab was selected for the study-design exercise because the monkey PBPK model without calibration to the analyzed in vivo data predicted AUC</w:t>
+        <w:t>, and evaluable clearance within two-fold of the observed values, and because the available model supported evaluation across five doses. A population of 50 virtual monkeys was combined with uncertainty in six molecule-specific inputs governing FcRn binding and TMDD: FcRn binding affinity, target binding affinity, target dissociation rate, drug-target complex internalization rate, target degradation rate, and target reference concentration. For each of two uncertainty scenarios (30% and 50% coefficient of variation), 100 independent parameter sets were drawn from lognormal distributions whose arithmetic means equaled the configured nominal values. Crossing each parameter set with the same 50-monkey physiology population generated 5,000 profiles per uncertainty level and dose across 0.1, 1, 3, 10, and 30 mg/kg. A total of 49,998 of the 50,000 requested profiles were successfully simulated; two profiles had numerical issues.</w:t>
+      </w:r>
+    </w:p>
+    <w:p>
+      <w:pPr>
+        <w:pStyle w:val="Normal"/>
+        <w:rPr/>
+      </w:pPr>
+      <w:r>
+        <w:rPr/>
+        <w:t>Candidate studies included two dose groups (1 and 10 mg/kg), three dose groups (0.1, 1, and 10 mg/kg), or five dose groups (0.1, 1, 3, 10, and 30 mg/kg), with two, three, or six animals per group. One thousand replicate studies were sampled with replacement at 0.25, 1, 2, 4, 8, 24, 48, 144, 240, 336, 504, and 672 hours. Within each dose group, the same sampled animals were used to calculate C</w:t>
+      </w:r>
+      <w:r>
+        <w:rPr>
+          <w:vertAlign w:val="subscript"/>
+        </w:rPr>
+        <w:t>max</w:t>
+      </w:r>
+      <w:r>
+        <w:rPr/>
+        <w:t>, AUC</w:t>
       </w:r>
       <w:r>
         <w:rPr>
@@ -922,46 +926,6 @@
       </w:r>
       <w:r>
         <w:rPr/>
-        <w:t>, C</w:t>
-      </w:r>
-      <w:r>
-        <w:rPr>
-          <w:vertAlign w:val="subscript"/>
-        </w:rPr>
-        <w:t>max</w:t>
-      </w:r>
-      <w:r>
-        <w:rPr/>
-        <w:t>, and evaluable clearance within two-fold of the observed values, and because the available model supported evaluation across five doses. A population of 50 virtual monkeys was combined with uncertainty in six molecule-specific inputs governing FcRn binding and TMDD: FcRn binding affinity, target binding affinity, target dissociation rate, drug-target complex internalization rate, target degradation rate, and target reference concentration. For each of two uncertainty scenarios (30% and 50% coefficient of variation), 100 independent parameter sets were drawn from lognormal distributions whose arithmetic means equaled the configured nominal values. Crossing each parameter set with the same 50-monkey physiology population generated 5,000 profiles per uncertainty level and dose across 0.1, 1, 3, 10, and 30 mg/kg. A total of 49,998 of the 50,000 requested profiles were successfully simulated; two profiles had numerical issues.</w:t>
-      </w:r>
-    </w:p>
-    <w:p>
-      <w:pPr>
-        <w:pStyle w:val="Normal"/>
-        <w:rPr/>
-      </w:pPr>
-      <w:r>
-        <w:rPr/>
-        <w:t>Candidate studies included two dose groups (1 and 10 mg/kg), three dose groups (0.1, 1, and 10 mg/kg), or five dose groups (0.1, 1, 3, 10, and 30 mg/kg), with two, three, or six animals per group. One thousand replicate studies were sampled with replacement at 0.25, 1, 2, 4, 8, 24, 48, 144, 240, 336, 504, and 672 hours. Within each dose group, the same sampled animals were used to calculate C</w:t>
-      </w:r>
-      <w:r>
-        <w:rPr>
-          <w:vertAlign w:val="subscript"/>
-        </w:rPr>
-        <w:t>max</w:t>
-      </w:r>
-      <w:r>
-        <w:rPr/>
-        <w:t>, AUC</w:t>
-      </w:r>
-      <w:r>
-        <w:rPr>
-          <w:vertAlign w:val="subscript"/>
-        </w:rPr>
-        <w:t>0-tlast</w:t>
-      </w:r>
-      <w:r>
-        <w:rPr/>
         <w:t>, and terminal clearance from AUC</w:t>
       </w:r>
       <w:r>
@@ -992,15 +956,7 @@
       </w:pPr>
       <w:r>
         <w:rPr/>
-        <w:t xml:space="preserve">For the two-dose design with three animals per group (n=6 total), 99.7% of replicate studies met the overall two-fold criterion under 30% input uncertainty and 97.6% met it under 50% input uncertainty (Figure </w:t>
-      </w:r>
-      <w:r>
-        <w:rPr/>
-        <w:t>3</w:t>
-      </w:r>
-      <w:r>
-        <w:rPr/>
-        <w:t xml:space="preserve">). Adding dose groups did not improve performance with three animals per group: overall success was 99.8% and 97.1% for the three-dose design and 99.7% and 94.7% for the five-dose design at 30% and 50% uncertainty, respectively. Under these model-based assumptions, two dose groups with three animals per group met the pre-specified precision criterion for Golimumab at both evaluated uncertainty levels.  </w:t>
+        <w:t xml:space="preserve">For the two-dose design with three animals per group (n=6 total), 99.7% of replicate studies met the overall two-fold criterion under 30% input uncertainty and 97.6% met it under 50% input uncertainty (Figure 3). Adding dose groups did not improve performance with three animals per group: overall success was 99.8% and 97.1% for the three-dose design and 99.7% and 94.7% for the five-dose design at 30% and 50% uncertainty, respectively. Under these model-based assumptions, two dose groups with three animals per group met the pre-specified precision criterion for Golimumab at both evaluated uncertainty levels.  </w:t>
       </w:r>
     </w:p>
     <w:p>
@@ -1086,15 +1042,7 @@
       </w:pPr>
       <w:r>
         <w:rPr/>
-        <w:t xml:space="preserve">In this example analysis, the study-design exercise addressed a narrower question: under specified levels of population variability and uncertainty in mechanistic in vitro inputs, could a smaller exploratory study recover the PK characteristics generated by the reference model? In the evaluated golimumab case study, the two-dose design with three monkeys per group met the joint two-fold performance criterion in 99.7% of simulated replicate studies at 30% input variability plus uncertainty and in 97.6% at 50% variability and uncertainty. Any comparison of animal use must also be interpreted within the appropriate context. In this exercise, using six rather than 15 animals represents a 60% reduction relative to the modeled five-dose design with three animals per group. It does not represent a universal comparison with current industry practice or a reduction across an entire development program. Figure </w:t>
-      </w:r>
-      <w:r>
-        <w:rPr/>
-        <w:t>4</w:t>
-      </w:r>
-      <w:r>
-        <w:rPr/>
-        <w:t xml:space="preserve"> shows how this decision could fit within a broader workflow, but the animal-number ranges are schematic. In practice, a sponsor may already use fewer dose groups, microsampling, cassette dosing, animal reuse, or PK/TK measurements incorporated into another study [17, 18, 30]. Anti-drug antibodies may also eliminate late PK observations, while biological variability or additional pharmacodynamic and safety endpoints may require more animals. The model-informed design should therefore be compared with the program’s actual feasible alternatives, including the use of data from an existing safety study or a suitable alternative model. The most defensible outcome is not a fixed animal count, but a fit-for-purpose design supported by explicit evidence and pre-specified decision criteria.</w:t>
+        <w:t>In this example analysis, the study-design exercise addressed a narrower question: under specified levels of population variability and uncertainty in mechanistic in vitro inputs, could a smaller exploratory study recover the PK characteristics generated by the reference model? In the evaluated golimumab case study, the two-dose design with three monkeys per group met the joint two-fold performance criterion in 99.7% of simulated replicate studies at 30% input variability plus uncertainty and in 97.6% at 50% variability and uncertainty. Any comparison of animal use must also be interpreted within the appropriate context. In this exercise, using six rather than 15 animals represents a 60% reduction relative to the modeled five-dose design with three animals per group. It does not represent a universal comparison with current industry practice or a reduction across an entire development program. Figure 4 shows how this decision could fit within a broader workflow, but the animal-number ranges are schematic. In practice, a sponsor may already use fewer dose groups, microsampling, cassette dosing, animal reuse, or PK/TK measurements incorporated into another study [17, 18, 30]. Anti-drug antibodies may also eliminate late PK observations, while biological variability or additional pharmacodynamic and safety endpoints may require more animals. The model-informed design should therefore be compared with the program’s actual feasible alternatives, including the use of data from an existing safety study or a suitable alternative model. The most defensible outcome is not a fixed animal count, but a fit-for-purpose design supported by explicit evidence and pre-specified decision criteria.</w:t>
       </w:r>
     </w:p>
     <w:p>
@@ -1650,9 +1598,7 @@
         </w:rPr>
       </w:pPr>
       <w:r>
-        <w:rPr>
-          <w:b/>
-        </w:rPr>
+        <w:rPr/>
         <w:drawing>
           <wp:inline distT="0" distB="0" distL="0" distR="0">
             <wp:extent cx="6804025" cy="3658870"/>
@@ -1894,40 +1840,23 @@
           <w:b/>
           <w:bCs/>
         </w:rPr>
-        <w:t xml:space="preserve">Figure </w:t>
-      </w:r>
-      <w:r>
+        <w:t>Figure 3. Fold errors for PK endpoints by number of dose groups and animals per group in the Golimumab study simulations.</w:t>
+      </w:r>
+      <w:r>
+        <w:rPr/>
+        <w:t xml:space="preserve"> Dashed red lines mark the pre-specified 0.5- to 2-fold interval.</w:t>
+      </w:r>
+    </w:p>
+    <w:p>
+      <w:pPr>
+        <w:pStyle w:val="Normal"/>
         <w:rPr>
           <w:b/>
           <w:bCs/>
         </w:rPr>
-        <w:t>3</w:t>
-      </w:r>
-      <w:r>
-        <w:rPr>
-          <w:b/>
-          <w:bCs/>
-        </w:rPr>
-        <w:t>. Fold errors for PK endpoints by number of dose groups and animals per group in the Golimumab study simulations.</w:t>
-      </w:r>
-      <w:r>
-        <w:rPr/>
-        <w:t xml:space="preserve"> Dashed red lines mark the pre-specified 0.5- to 2-fold interval.</w:t>
-      </w:r>
-    </w:p>
-    <w:p>
-      <w:pPr>
-        <w:pStyle w:val="Normal"/>
-        <w:rPr>
-          <w:b/>
-          <w:bCs/>
-        </w:rPr>
-      </w:pPr>
-      <w:r>
-        <w:rPr>
-          <w:b/>
-          <w:bCs/>
-        </w:rPr>
+      </w:pPr>
+      <w:r>
+        <w:rPr/>
         <w:drawing>
           <wp:inline distT="0" distB="0" distL="0" distR="0">
             <wp:extent cx="6813550" cy="3622040"/>
@@ -1983,21 +1912,7 @@
           <w:b/>
           <w:bCs/>
         </w:rPr>
-        <w:t xml:space="preserve">Figure </w:t>
-      </w:r>
-      <w:r>
-        <w:rPr>
-          <w:b/>
-          <w:bCs/>
-        </w:rPr>
-        <w:t>4</w:t>
-      </w:r>
-      <w:r>
-        <w:rPr>
-          <w:b/>
-          <w:bCs/>
-        </w:rPr>
-        <w:t>.</w:t>
+        <w:t>Figure 4.</w:t>
       </w:r>
       <w:r>
         <w:rPr/>
@@ -3172,8 +3087,8 @@
       <w:bCs/>
     </w:rPr>
   </w:style>
-  <w:style w:type="character" w:styleId="Bulletsuser">
-    <w:name w:val="Bullets (user)"/>
+  <w:style w:type="character" w:styleId="Bullets">
+    <w:name w:val="Bullets"/>
     <w:qFormat/>
     <w:rPr>
       <w:rFonts w:ascii="OpenSymbol" w:hAnsi="OpenSymbol" w:eastAsia="OpenSymbol" w:cs="OpenSymbol"/>
@@ -3513,8 +3428,8 @@
       <w:szCs w:val="20"/>
     </w:rPr>
   </w:style>
-  <w:style w:type="paragraph" w:styleId="FrameContentsuser">
-    <w:name w:val="Frame Contents (user)"/>
+  <w:style w:type="paragraph" w:styleId="FrameContents">
+    <w:name w:val="Frame Contents"/>
     <w:basedOn w:val="Normal"/>
     <w:qFormat/>
     <w:pPr/>

</xml_diff>